<commit_message>
Improve startup performance and translator workflows
</commit_message>
<xml_diff>
--- a/docs/beginner-guide/LoopCAT-Beginners-Guide.docx
+++ b/docs/beginner-guide/LoopCAT-Beginners-Guide.docx
@@ -102,13 +102,7 @@
         <w:jc w:val="center"/>
       </w:pPr>
       <w:r>
-        <w:rPr>
-          <w:rFonts w:ascii="Calibri" w:hAnsi="Calibri" w:eastAsia="Calibri" w:cs="Calibri"/>
-          <w:b/>
-          <w:color w:val="58716D"/>
-          <w:sz w:val="21"/>
-        </w:rPr>
-        <w:t>Preview edition  •  September 2026</w:t>
+        <w:t>Preview edition  •  September 2026  •  LoopCAT 0.0.4-dev.20260914.5</w:t>
       </w:r>
     </w:p>
     <w:p>
@@ -475,11 +469,7 @@
         <w:spacing w:after="120"/>
       </w:pPr>
       <w:r>
-        <w:rPr>
-          <w:rFonts w:ascii="Calibri" w:hAnsi="Calibri" w:eastAsia="Calibri" w:cs="Calibri"/>
-          <w:color w:val="17312E"/>
-        </w:rPr>
-        <w:t>LoopCAT is currently distributed as an unsigned development preview. The Windows desktop packages are the simplest way to get started; LoopCAT Web is useful when you want a browser-based copy.</w:t>
+        <w:t>LoopCAT is currently distributed as an unsigned development preview for Windows, macOS, Linux, and the web. Choose the package built for your operating system; Windows users can also choose a portable edition.</w:t>
       </w:r>
     </w:p>
     <w:tbl>
@@ -825,6 +815,112 @@
           </w:p>
         </w:tc>
       </w:tr>
+      <w:tr>
+        <w:tc>
+          <w:tcPr>
+            <w:tcW w:type="dxa" w:w="2000"/>
+            <w:vAlign w:val="center"/>
+            <w:tcMar>
+              <w:top w:w="80" w:type="dxa"/>
+              <w:start w:w="120" w:type="dxa"/>
+              <w:bottom w:w="80" w:type="dxa"/>
+              <w:end w:w="120" w:type="dxa"/>
+            </w:tcMar>
+          </w:tcPr>
+          <w:p>
+            <w:r>
+              <w:t>macOS</w:t>
+            </w:r>
+          </w:p>
+        </w:tc>
+        <w:tc>
+          <w:tcPr>
+            <w:tcW w:type="dxa" w:w="3100"/>
+            <w:vAlign w:val="center"/>
+            <w:tcMar>
+              <w:top w:w="80" w:type="dxa"/>
+              <w:start w:w="120" w:type="dxa"/>
+              <w:bottom w:w="80" w:type="dxa"/>
+              <w:end w:w="120" w:type="dxa"/>
+            </w:tcMar>
+          </w:tcPr>
+          <w:p>
+            <w:r>
+              <w:t>Regular use on a Mac</w:t>
+            </w:r>
+          </w:p>
+        </w:tc>
+        <w:tc>
+          <w:tcPr>
+            <w:tcW w:type="dxa" w:w="4260"/>
+            <w:vAlign w:val="center"/>
+            <w:tcMar>
+              <w:top w:w="80" w:type="dxa"/>
+              <w:start w:w="120" w:type="dxa"/>
+              <w:bottom w:w="80" w:type="dxa"/>
+              <w:end w:w="120" w:type="dxa"/>
+            </w:tcMar>
+          </w:tcPr>
+          <w:p>
+            <w:r>
+              <w:t>Download the DMG, open it, and copy LoopCAT to Applications. A ZIP edition is also available.</w:t>
+            </w:r>
+          </w:p>
+        </w:tc>
+      </w:tr>
+      <w:tr>
+        <w:tc>
+          <w:tcPr>
+            <w:tcW w:type="dxa" w:w="2000"/>
+            <w:vAlign w:val="center"/>
+            <w:tcMar>
+              <w:top w:w="80" w:type="dxa"/>
+              <w:start w:w="120" w:type="dxa"/>
+              <w:bottom w:w="80" w:type="dxa"/>
+              <w:end w:w="120" w:type="dxa"/>
+            </w:tcMar>
+          </w:tcPr>
+          <w:p>
+            <w:r>
+              <w:t>Linux</w:t>
+            </w:r>
+          </w:p>
+        </w:tc>
+        <w:tc>
+          <w:tcPr>
+            <w:tcW w:type="dxa" w:w="3100"/>
+            <w:vAlign w:val="center"/>
+            <w:tcMar>
+              <w:top w:w="80" w:type="dxa"/>
+              <w:start w:w="120" w:type="dxa"/>
+              <w:bottom w:w="80" w:type="dxa"/>
+              <w:end w:w="120" w:type="dxa"/>
+            </w:tcMar>
+          </w:tcPr>
+          <w:p>
+            <w:r>
+              <w:t>Ubuntu/Debian or portable Linux use</w:t>
+            </w:r>
+          </w:p>
+        </w:tc>
+        <w:tc>
+          <w:tcPr>
+            <w:tcW w:type="dxa" w:w="4260"/>
+            <w:vAlign w:val="center"/>
+            <w:tcMar>
+              <w:top w:w="80" w:type="dxa"/>
+              <w:start w:w="120" w:type="dxa"/>
+              <w:bottom w:w="80" w:type="dxa"/>
+              <w:end w:w="120" w:type="dxa"/>
+            </w:tcMar>
+          </w:tcPr>
+          <w:p>
+            <w:r>
+              <w:t>Install the DEB, or make the AppImage executable and run it.</w:t>
+            </w:r>
+          </w:p>
+        </w:tc>
+      </w:tr>
     </w:tbl>
     <w:p>
       <w:pPr>
@@ -849,18 +945,12 @@
       </w:pPr>
       <w:r>
         <w:rPr>
-          <w:rFonts w:ascii="Calibri" w:hAnsi="Calibri" w:eastAsia="Calibri" w:cs="Calibri"/>
           <w:b/>
-          <w:color w:val="0B3F3A"/>
         </w:rPr>
-        <w:t>Open the official downloads folder</w:t>
+        <w:t>Open the current GitHub release</w:t>
       </w:r>
       <w:r>
-        <w:rPr>
-          <w:rFonts w:ascii="Calibri" w:hAnsi="Calibri" w:eastAsia="Calibri" w:cs="Calibri"/>
-          <w:color w:val="17312E"/>
-        </w:rPr>
-        <w:t xml:space="preserve"> — Use the versioned files in the LoopCAT repository, not GitHub's automatic Source code ZIP.</w:t>
+        <w:t xml:space="preserve"> — Use its versioned application packages, not GitHub's automatic Source code ZIP.</w:t>
       </w:r>
     </w:p>
     <w:p>
@@ -873,18 +963,12 @@
       </w:pPr>
       <w:r>
         <w:rPr>
-          <w:rFonts w:ascii="Calibri" w:hAnsi="Calibri" w:eastAsia="Calibri" w:cs="Calibri"/>
           <w:b/>
-          <w:color w:val="0B3F3A"/>
         </w:rPr>
-        <w:t>Choose one Windows package</w:t>
+        <w:t>Choose your package</w:t>
       </w:r>
       <w:r>
-        <w:rPr>
-          <w:rFonts w:ascii="Calibri" w:hAnsi="Calibri" w:eastAsia="Calibri" w:cs="Calibri"/>
-          <w:color w:val="17312E"/>
-        </w:rPr>
-        <w:t xml:space="preserve"> — Pick the Setup ZIP for a normal installation or the Portable ZIP for a no-install copy.</w:t>
+        <w:t xml:space="preserve"> — Use Windows Setup for a normal Windows installation, DMG on macOS, DEB on Ubuntu or Debian, AppImage for portable Linux use, or Web ZIP for a browser copy.</w:t>
       </w:r>
     </w:p>
     <w:p>
@@ -897,18 +981,12 @@
       </w:pPr>
       <w:r>
         <w:rPr>
-          <w:rFonts w:ascii="Calibri" w:hAnsi="Calibri" w:eastAsia="Calibri" w:cs="Calibri"/>
           <w:b/>
-          <w:color w:val="0B3F3A"/>
         </w:rPr>
-        <w:t>Extract the ZIP</w:t>
+        <w:t>Open the package</w:t>
       </w:r>
       <w:r>
-        <w:rPr>
-          <w:rFonts w:ascii="Calibri" w:hAnsi="Calibri" w:eastAsia="Calibri" w:cs="Calibri"/>
-          <w:color w:val="17312E"/>
-        </w:rPr>
-        <w:t xml:space="preserve"> — Right-click the downloaded ZIP, choose Extract All, and open the extracted folder.</w:t>
+        <w:t xml:space="preserve"> — Extract Windows and web ZIPs; open the macOS DMG; install the Linux DEB; or make the Linux AppImage executable.</w:t>
       </w:r>
     </w:p>
     <w:p>
@@ -945,18 +1023,12 @@
       </w:pPr>
       <w:r>
         <w:rPr>
-          <w:rFonts w:ascii="Calibri" w:hAnsi="Calibri" w:eastAsia="Calibri" w:cs="Calibri"/>
           <w:b/>
-          <w:color w:val="0B3F3A"/>
         </w:rPr>
         <w:t>Run LoopCAT</w:t>
       </w:r>
       <w:r>
-        <w:rPr>
-          <w:rFonts w:ascii="Calibri" w:hAnsi="Calibri" w:eastAsia="Calibri" w:cs="Calibri"/>
-          <w:color w:val="17312E"/>
-        </w:rPr>
-        <w:t xml:space="preserve"> — Open the Setup EXE or Portable EXE from the extracted folder.</w:t>
+        <w:t xml:space="preserve"> — Open the installed application or the extracted portable/web edition.</w:t>
       </w:r>
     </w:p>
     <w:p>
@@ -965,21 +1037,8 @@
         <w:spacing w:after="40"/>
       </w:pPr>
       <w:r>
-        <w:rPr>
-          <w:rFonts w:ascii="Calibri" w:hAnsi="Calibri" w:eastAsia="Calibri" w:cs="Calibri"/>
-          <w:color w:val="17312E"/>
-        </w:rPr>
-        <w:t xml:space="preserve">Official downloads: </w:t>
+        <w:t>Current release: github.com/gokhandogru/LoopCAT/releases/tag/preview-0.0.4-dev.20260914.5</w:t>
       </w:r>
-      <w:hyperlink r:id="rId12">
-        <w:r>
-          <w:rPr>
-            <w:color w:val="0B756D"/>
-            <w:u w:val="single"/>
-          </w:rPr>
-          <w:t>github.com/gokhandogru/LoopCAT/tree/main/downloads</w:t>
-        </w:r>
-      </w:hyperlink>
     </w:p>
     <w:p>
       <w:pPr>
@@ -992,21 +1051,7 @@
         </w:pBdr>
       </w:pPr>
       <w:r>
-        <w:rPr>
-          <w:rFonts w:ascii="Calibri" w:hAnsi="Calibri" w:eastAsia="Calibri" w:cs="Calibri"/>
-          <w:b/>
-          <w:color w:val="A45A18"/>
-          <w:sz w:val="19"/>
-        </w:rPr>
-        <w:t xml:space="preserve">WINDOWS SECURITY MESSAGE  </w:t>
-      </w:r>
-      <w:r>
-        <w:rPr>
-          <w:rFonts w:ascii="Calibri" w:hAnsi="Calibri" w:eastAsia="Calibri" w:cs="Calibri"/>
-          <w:color w:val="17312E"/>
-          <w:sz w:val="21"/>
-        </w:rPr>
-        <w:t>The current Windows preview is unsigned, so SmartScreen may show an unknown-publisher warning. LoopCAT does not bypass this warning. Continue only after verifying the checksum and confirming that the file came from the trusted LoopCAT repository.</w:t>
+        <w:t>DESKTOP SECURITY MESSAGE  The current desktop preview is unsigned. Windows SmartScreen or macOS Gatekeeper may show an unknown-publisher warning. LoopCAT does not bypass these protections. Continue only after verifying the checksum and confirming that the file came from the trusted LoopCAT release.</w:t>
       </w:r>
     </w:p>
     <w:p>
@@ -1055,11 +1100,7 @@
         <w:spacing w:after="120"/>
       </w:pPr>
       <w:r>
-        <w:rPr>
-          <w:rFonts w:ascii="Calibri" w:hAnsi="Calibri" w:eastAsia="Calibri" w:cs="Calibri"/>
-          <w:color w:val="17312E"/>
-        </w:rPr>
-        <w:t>Compare the complete hash with the matching filename in LoopCAT's SHA256SUMS file. A checksum detects a damaged or mismatched download; it is not a publisher signature.</w:t>
+        <w:t>Compare the complete hash with the matching filename in the release's combined SHA256SUMS.txt file. A checksum detects a damaged or mismatched download; it is not a publisher signature.</w:t>
       </w:r>
     </w:p>
     <w:p>
@@ -1119,11 +1160,23 @@
       </w:r>
     </w:p>
     <w:p>
+      <w:pPr/>
+      <w:r>
+        <w:t>On macOS, open the DMG and copy LoopCAT to Applications. On Ubuntu or Debian, install the DEB with sudo apt install ./loopcat_&lt;version&gt;_amd64.deb. For portable Linux use, run chmod +x LoopCAT-&lt;version&gt;.AppImage and then open the AppImage.</w:t>
+      </w:r>
+    </w:p>
+    <w:p>
       <w:pPr>
         <w:pStyle w:val="Heading1"/>
       </w:pPr>
       <w:r>
         <w:t>2. Start your first project</w:t>
+      </w:r>
+    </w:p>
+    <w:p>
+      <w:pPr/>
+      <w:r>
+        <w:t>LoopCAT shows the project catalog first when it starts. It quietly prepares up to three recently opened or newly created projects, so returning to current work usually opens quickly. You can select a project as soon as its action is enabled; larger projects load their content on demand.</w:t>
       </w:r>
     </w:p>
     <w:p>
@@ -1268,18 +1321,12 @@
       </w:pPr>
       <w:r>
         <w:rPr>
-          <w:rFonts w:ascii="Calibri" w:hAnsi="Calibri" w:eastAsia="Calibri" w:cs="Calibri"/>
           <w:b/>
-          <w:color w:val="0B3F3A"/>
         </w:rPr>
-        <w:t>Open Storage and resources if needed</w:t>
+        <w:t>Review Optional Resource Settings if useful</w:t>
       </w:r>
       <w:r>
-        <w:rPr>
-          <w:rFonts w:ascii="Calibri" w:hAnsi="Calibri" w:eastAsia="Calibri" w:cs="Calibri"/>
-          <w:color w:val="17312E"/>
-        </w:rPr>
-        <w:t xml:space="preserve"> — Optionally save a visible package folder, select existing resources, create a main TM or termbase, and configure AI settings.</w:t>
+        <w:t xml:space="preserve"> — Link or draft multiple resources in a separate dialog. Untouched settings create a project-named main TM and active termbase. Storage and AI settings remain in the main project form.</w:t>
       </w:r>
     </w:p>
     <w:p>
@@ -1534,18 +1581,12 @@
       </w:pPr>
       <w:r>
         <w:rPr>
-          <w:rFonts w:ascii="Calibri" w:hAnsi="Calibri" w:eastAsia="Calibri" w:cs="Calibri"/>
           <w:b/>
-          <w:color w:val="0B3F3A"/>
         </w:rPr>
-        <w:t>Review the file card</w:t>
+        <w:t>Review the file</w:t>
       </w:r>
       <w:r>
-        <w:rPr>
-          <w:rFonts w:ascii="Calibri" w:hAnsi="Calibri" w:eastAsia="Calibri" w:cs="Calibri"/>
-          <w:color w:val="17312E"/>
-        </w:rPr>
-        <w:t xml:space="preserve"> — Check the filename, word and segment counts, and progress summary.</w:t>
+        <w:t xml:space="preserve"> — Check its name, word and segment counts, and progress. Choose Cards or List if another layout is easier to scan.</w:t>
       </w:r>
     </w:p>
     <w:p>
@@ -1827,17 +1868,8 @@
             </w:tcMar>
           </w:tcPr>
           <w:p>
-            <w:pPr>
-              <w:spacing w:after="0"/>
-            </w:pPr>
             <w:r>
-              <w:rPr>
-                <w:rFonts w:ascii="Calibri" w:hAnsi="Calibri" w:eastAsia="Calibri" w:cs="Calibri"/>
-                <w:b w:val="0"/>
-                <w:color w:val="17312E"/>
-                <w:sz w:val="19"/>
-              </w:rPr>
-              <w:t>Where you type or insert the translation.</w:t>
+              <w:t>Where you type or insert the translation; protected tags remain green, locked chips.</w:t>
             </w:r>
           </w:p>
         </w:tc>
@@ -1854,17 +1886,8 @@
             </w:tcMar>
           </w:tcPr>
           <w:p>
-            <w:pPr>
-              <w:spacing w:after="0"/>
-            </w:pPr>
             <w:r>
-              <w:rPr>
-                <w:rFonts w:ascii="Calibri" w:hAnsi="Calibri" w:eastAsia="Calibri" w:cs="Calibri"/>
-                <w:b w:val="0"/>
-                <w:color w:val="17312E"/>
-                <w:sz w:val="19"/>
-              </w:rPr>
-              <w:t>Click the cell, translate, then confirm.</w:t>
+              <w:t>Click the cell, translate, move whole tags if needed, then confirm.</w:t>
             </w:r>
           </w:p>
         </w:tc>
@@ -2173,29 +2196,7 @@
         </w:pBdr>
       </w:pPr>
       <w:r>
-        <w:rPr>
-          <w:rFonts w:ascii="Calibri" w:hAnsi="Calibri" w:eastAsia="Calibri" w:cs="Calibri"/>
-          <w:b/>
-          <w:color w:val="0B756D"/>
-          <w:sz w:val="23"/>
-        </w:rPr>
-        <w:t xml:space="preserve">02  </w:t>
-      </w:r>
-      <w:r>
-        <w:rPr>
-          <w:rFonts w:ascii="Calibri" w:hAnsi="Calibri" w:eastAsia="Calibri" w:cs="Calibri"/>
-          <w:b/>
-          <w:color w:val="0B3F3A"/>
-        </w:rPr>
-        <w:t>Use a suggestion or translate manually</w:t>
-      </w:r>
-      <w:r>
-        <w:rPr>
-          <w:rFonts w:ascii="Calibri" w:hAnsi="Calibri" w:eastAsia="Calibri" w:cs="Calibri"/>
-          <w:color w:val="17312E"/>
-          <w:sz w:val="21"/>
-        </w:rPr>
-        <w:t xml:space="preserve"> — Press Tab to open Quick Insert when matches are available, or type your own target.</w:t>
+        <w:t>02  Use a suggestion or translate manually — Tab accepts a visible predictive completion; Alt+Insert opens full Quick Insert alternatives.</w:t>
       </w:r>
     </w:p>
     <w:p>
@@ -2209,29 +2210,7 @@
         </w:pBdr>
       </w:pPr>
       <w:r>
-        <w:rPr>
-          <w:rFonts w:ascii="Calibri" w:hAnsi="Calibri" w:eastAsia="Calibri" w:cs="Calibri"/>
-          <w:b/>
-          <w:color w:val="0B756D"/>
-          <w:sz w:val="23"/>
-        </w:rPr>
-        <w:t xml:space="preserve">03  </w:t>
-      </w:r>
-      <w:r>
-        <w:rPr>
-          <w:rFonts w:ascii="Calibri" w:hAnsi="Calibri" w:eastAsia="Calibri" w:cs="Calibri"/>
-          <w:b/>
-          <w:color w:val="0B3F3A"/>
-        </w:rPr>
-        <w:t>Preserve protected tags</w:t>
-      </w:r>
-      <w:r>
-        <w:rPr>
-          <w:rFonts w:ascii="Calibri" w:hAnsi="Calibri" w:eastAsia="Calibri" w:cs="Calibri"/>
-          <w:color w:val="17312E"/>
-          <w:sz w:val="21"/>
-        </w:rPr>
-        <w:t xml:space="preserve"> — Copy required tag chips into the correct place. F8 inserts the next missing protected tag.</w:t>
+        <w:t>03  Preserve protected tags — Green tag chips stay locked while you type. F8 inserts the next missing tag at the caret and leaves the cursor immediately after it.</w:t>
       </w:r>
     </w:p>
     <w:p>
@@ -2245,29 +2224,7 @@
         </w:pBdr>
       </w:pPr>
       <w:r>
-        <w:rPr>
-          <w:rFonts w:ascii="Calibri" w:hAnsi="Calibri" w:eastAsia="Calibri" w:cs="Calibri"/>
-          <w:b/>
-          <w:color w:val="0B756D"/>
-          <w:sz w:val="23"/>
-        </w:rPr>
-        <w:t xml:space="preserve">04  </w:t>
-      </w:r>
-      <w:r>
-        <w:rPr>
-          <w:rFonts w:ascii="Calibri" w:hAnsi="Calibri" w:eastAsia="Calibri" w:cs="Calibri"/>
-          <w:b/>
-          <w:color w:val="0B3F3A"/>
-        </w:rPr>
-        <w:t>Confirm</w:t>
-      </w:r>
-      <w:r>
-        <w:rPr>
-          <w:rFonts w:ascii="Calibri" w:hAnsi="Calibri" w:eastAsia="Calibri" w:cs="Calibri"/>
-          <w:color w:val="17312E"/>
-          <w:sz w:val="21"/>
-        </w:rPr>
-        <w:t xml:space="preserve"> — Press Ctrl+Enter on Windows/Linux or Cmd+Enter on macOS. Confirmation records the completed state; with a main TM, it can also make the translation reusable.</w:t>
+        <w:t>04  Confirm — Press Ctrl+Enter on Windows/Linux or Cmd+Enter on macOS. Confirmation saves the segment and its main-TM contribution together; the segment status shows the result without a routine banner.</w:t>
       </w:r>
     </w:p>
     <w:p>
@@ -2317,21 +2274,7 @@
         </w:pBdr>
       </w:pPr>
       <w:r>
-        <w:rPr>
-          <w:rFonts w:ascii="Calibri" w:hAnsi="Calibri" w:eastAsia="Calibri" w:cs="Calibri"/>
-          <w:b/>
-          <w:color w:val="E66A47"/>
-          <w:sz w:val="19"/>
-        </w:rPr>
-        <w:t xml:space="preserve">SAVING  </w:t>
-      </w:r>
-      <w:r>
-        <w:rPr>
-          <w:rFonts w:ascii="Calibri" w:hAnsi="Calibri" w:eastAsia="Calibri" w:cs="Calibri"/>
-          <w:color w:val="17312E"/>
-          <w:sz w:val="21"/>
-        </w:rPr>
-        <w:t>Target edits are autosaved locally. Watch the save status at the top of the app. A Saved indicator is reassuring, but a portable project package is still the safer long-term backup.</w:t>
+        <w:t>SAVING  Target edits autosave locally without interrupting your typing. Open Workspace to check local saving and backup status. Real save failures appear above the editor and remain visible until resolved. Keep a portable project package as an independent backup.</w:t>
       </w:r>
     </w:p>
     <w:p>
@@ -2456,6 +2399,12 @@
       </w:r>
     </w:p>
     <w:p>
+      <w:pPr/>
+      <w:r>
+        <w:t>The Resources view shows names and counts first. Opening a large TM or termbase loads entries in pages of 100; use Previous and Next to move through it without waiting for the whole library.</w:t>
+      </w:r>
+    </w:p>
+    <w:p>
       <w:pPr>
         <w:keepLines/>
         <w:numPr>
@@ -2517,11 +2466,7 @@
         <w:spacing w:after="120"/>
       </w:pPr>
       <w:r>
-        <w:rPr>
-          <w:rFonts w:ascii="Calibri" w:hAnsi="Calibri" w:eastAsia="Calibri" w:cs="Calibri"/>
-          <w:color w:val="17312E"/>
-        </w:rPr>
-        <w:t>Press Tab in an active Target field when suggestions exist. Quick Insert can show up to four TM matches, three approved terminology suggestions, and two already-saved AI suggestions. Navigate with Up/Down or Tab/Shift+Tab, press 1–9 to choose directly, Enter to apply, or Escape to close.</w:t>
+        <w:t>Press Alt+Insert, or press Tab when no predictive completion is visible. Quick Insert can show up to four TM matches, three approved terminology suggestions, and two saved AI suggestions. Navigate with Up/Down or Tab/Shift+Tab, press 1–9 to choose directly, Enter to apply, or Escape to close.</w:t>
       </w:r>
     </w:p>
     <w:p>
@@ -2594,6 +2539,12 @@
       </w:r>
     </w:p>
     <w:p>
+      <w:pPr/>
+      <w:r>
+        <w:t>Choose Cards or List anywhere LoopCAT lists projects, project files, resources, resource entries, resource selections, or Trash. LoopCAT remembers each category separately; Workspace → Reset layout restores the defaults.</w:t>
+      </w:r>
+    </w:p>
+    <w:p>
       <w:pPr>
         <w:pStyle w:val="Heading2"/>
       </w:pPr>
@@ -2607,11 +2558,7 @@
         <w:spacing w:after="120"/>
       </w:pPr>
       <w:r>
-        <w:rPr>
-          <w:rFonts w:ascii="Calibri" w:hAnsi="Calibri" w:eastAsia="Calibri" w:cs="Calibri"/>
-          <w:color w:val="17312E"/>
-        </w:rPr>
-        <w:t>Formatting codes, variables, and inline markup appear as protected chips. Keep every required chip in the target and place it around the correct translated text. LoopCAT prevents confirmation when required placeholders are missing.</w:t>
+        <w:t>Formatting codes, variables, and inline markup appear as green protected chips while you edit. Their contents stay locked. You can select, move, or delete a whole tag. Keep every required chip in the target and place it around the correct translated text. LoopCAT prevents confirmation when required placeholders are missing.</w:t>
       </w:r>
     </w:p>
     <w:p>
@@ -2623,11 +2570,7 @@
         </w:numPr>
       </w:pPr>
       <w:r>
-        <w:rPr>
-          <w:rFonts w:ascii="Calibri" w:hAnsi="Calibri" w:eastAsia="Calibri" w:cs="Calibri"/>
-          <w:color w:val="17312E"/>
-        </w:rPr>
-        <w:t>F8 inserts the next missing tag at the caret.</w:t>
+        <w:t>F8 inserts the next missing tag at the caret and returns the cursor immediately after the chip.</w:t>
       </w:r>
     </w:p>
     <w:p>
@@ -2655,11 +2598,7 @@
         </w:numPr>
       </w:pPr>
       <w:r>
-        <w:rPr>
-          <w:rFonts w:ascii="Calibri" w:hAnsi="Calibri" w:eastAsia="Calibri" w:cs="Calibri"/>
-          <w:color w:val="17312E"/>
-        </w:rPr>
-        <w:t>Do not translate the text inside variable or placeholder tokens unless the file format explicitly requires it.</w:t>
+        <w:t>Do not edit the contents of a protected token. Move or delete the whole chip only when the file structure requires it.</w:t>
       </w:r>
     </w:p>
     <w:p>
@@ -2676,11 +2615,7 @@
         <w:spacing w:after="120"/>
       </w:pPr>
       <w:r>
-        <w:rPr>
-          <w:rFonts w:ascii="Calibri" w:hAnsi="Calibri" w:eastAsia="Calibri" w:cs="Calibri"/>
-          <w:color w:val="17312E"/>
-        </w:rPr>
-        <w:t>Use Ctrl/Cmd+F to search source, target, or both. Filter by document, segment status, review state, or AI status. Workflow presets such as Translate, Review, QA fixes, and AI review combine common filters. Focus mode hides supporting panels so you can concentrate on the segment grid.</w:t>
+        <w:t>Use Ctrl/Cmd+F to search. Search options contains source/target scope, regular expressions, and case matching. The document and segment-status selectors stay beside search; Filters contains workflow presets, review states, and AI states. An Active badge identifies non-default options. Press Escape to close a menu. Focus mode gives the grid more room. Open Workspace → Beginner Guide to return to this guide.</w:t>
       </w:r>
     </w:p>
     <w:p>
@@ -4777,19 +4712,7 @@
         <w:spacing w:after="100"/>
       </w:pPr>
       <w:r>
-        <w:rPr>
-          <w:rFonts w:ascii="Calibri" w:hAnsi="Calibri" w:eastAsia="Calibri" w:cs="Calibri"/>
-          <w:b/>
-          <w:color w:val="0B756D"/>
-        </w:rPr>
-        <w:t>The interface feels crowded</w:t>
-      </w:r>
-      <w:r>
-        <w:rPr>
-          <w:rFonts w:ascii="Calibri" w:hAnsi="Calibri" w:eastAsia="Calibri" w:cs="Calibri"/>
-          <w:color w:val="17312E"/>
-        </w:rPr>
-        <w:t xml:space="preserve">  Use Focus mode, resize or hide the Inspector, choose Compact density, or reset the workspace layout from Workspace → Appearance.</w:t>
+        <w:t>The interface feels crowded  Use Focus mode, resize or hide the Inspector, choose Compact density, switch Cards/List, or reset the layout from Workspace → Appearance.</w:t>
       </w:r>
     </w:p>
     <w:p>

</xml_diff>

<commit_message>
Fix direct-file web workers and gate releases on real Chrome workflows
</commit_message>
<xml_diff>
--- a/docs/beginner-guide/LoopCAT-Beginners-Guide.docx
+++ b/docs/beginner-guide/LoopCAT-Beginners-Guide.docx
@@ -102,7 +102,7 @@
         <w:jc w:val="center"/>
       </w:pPr>
       <w:r>
-        <w:t>Preview edition  •  September 2026  •  LoopCAT 0.0.4-dev.20260914.5</w:t>
+        <w:t>Preview edition  •  September 2026  •  LoopCAT 0.0.4-dev.20260915.1</w:t>
       </w:r>
     </w:p>
     <w:p>
@@ -1037,7 +1037,7 @@
         <w:spacing w:after="40"/>
       </w:pPr>
       <w:r>
-        <w:t>Current release: github.com/gokhandogru/LoopCAT/releases/tag/preview-0.0.4-dev.20260914.5</w:t>
+        <w:t>Current release: github.com/gokhandogru/LoopCAT/releases/tag/preview-0.0.4-dev.20260915.1</w:t>
       </w:r>
     </w:p>
     <w:p>

</xml_diff>